<commit_message>
build based on 56de669
</commit_message>
<xml_diff>
--- a/dev/example.docx
+++ b/dev/example.docx
@@ -126,8 +126,8 @@
   <w:style w:type="paragraph" w:styleId="Heading5">
     <w:pPr>
       <w:rPr>
+        <w:i/>
         <w:sz w:val="22"/>
-        <w:i/>
       </w:rPr>
       <w:spacing w:before="120" w:after="80"/>
     </w:pPr>
@@ -146,8 +146,8 @@
   <w:style w:type="paragraph" w:styleId="Heading6">
     <w:pPr>
       <w:rPr>
+        <w:i/>
         <w:sz w:val="20"/>
-        <w:i/>
       </w:rPr>
       <w:spacing w:before="120" w:after="80"/>
     </w:pPr>

</xml_diff>